<commit_message>
docs(guides): mode d'emploi detaille de l'empreinte digitale (WebAuthn)
Guides Parent & Coach + Module 6 du support de formation :
- comment ca fonctionne : capteur DE L'APPAREIL (telephone, Windows Hello),
  l'empreinte ne quitte jamais l'appareil, EduWeb ne recoit qu'une preuve
  chiffree (WebAuthn) ;
- enregistrement pas a pas (une fois par appareil), verification avant
  chaque test (validite ~10 min), suppression ;
- cas particuliers : facultatif, changement d'appareil, capteur absent ;
- M6 : etape de TP optionnelle + QCM « ou l'empreinte est-elle conservee ? »
  + « a retenir ».

Co-Authored-By: Claude Opus 4.8 (1M context) <noreply@anthropic.com>
</commit_message>
<xml_diff>
--- a/guides/Guide-Coach-EduWeb.docx
+++ b/guides/Guide-Coach-EduWeb.docx
@@ -2047,78 +2047,216 @@
     </w:p>
     <w:p>
       <w:pPr>
-        <w:pStyle w:val="ListParagraph"/>
-        <w:numPr>
-          <w:ilvl w:val="0"/>
-          <w:numId w:val="2"/>
-        </w:numPr>
-        <w:spacing w:after="40"/>
-      </w:pPr>
-      <w:r>
-        <w:rPr>
-          <w:sz w:val="22"/>
-          <w:szCs w:val="22"/>
-        </w:rPr>
-        <w:t xml:space="preserve">Si votre appareil le permet, vous pouvez enregistrer votre empreinte digitale : elle vous sera demandée avant chaque test (facultatif, l'empreinte ne quitte jamais votre appareil).</w:t>
-      </w:r>
-    </w:p>
-    <w:p>
-      <w:pPr>
         <w:pStyle w:val="Heading2"/>
       </w:pPr>
       <w:r>
-        <w:t xml:space="preserve">Comprendre vos résultats</w:t>
-      </w:r>
-    </w:p>
-    <w:p>
-      <w:pPr>
-        <w:pStyle w:val="ListParagraph"/>
-        <w:numPr>
-          <w:ilvl w:val="0"/>
-          <w:numId w:val="2"/>
-        </w:numPr>
-        <w:spacing w:after="40"/>
-      </w:pPr>
-      <w:r>
-        <w:rPr>
-          <w:sz w:val="22"/>
-          <w:szCs w:val="22"/>
-        </w:rPr>
-        <w:t xml:space="preserve">Après chaque test : votre score, vos points forts et vos points à travailler, un plan d'amélioration concret et des conseils d'orientation (quels concours correspondent à votre profil).</w:t>
-      </w:r>
-    </w:p>
-    <w:p>
-      <w:pPr>
-        <w:pStyle w:val="ListParagraph"/>
-        <w:numPr>
-          <w:ilvl w:val="0"/>
-          <w:numId w:val="2"/>
-        </w:numPr>
-        <w:spacing w:after="40"/>
-      </w:pPr>
-      <w:r>
-        <w:rPr>
-          <w:sz w:val="22"/>
-          <w:szCs w:val="22"/>
-        </w:rPr>
-        <w:t xml:space="preserve">La correction complète est disponible question par question, avec l'explication de la bonne réponse — et le bouton « 🔊 Écouter » sur chacune.</w:t>
-      </w:r>
-    </w:p>
-    <w:p>
-      <w:pPr>
-        <w:pStyle w:val="ListParagraph"/>
-        <w:numPr>
-          <w:ilvl w:val="0"/>
-          <w:numId w:val="2"/>
-        </w:numPr>
-        <w:spacing w:after="40"/>
-      </w:pPr>
-      <w:r>
-        <w:rPr>
-          <w:sz w:val="22"/>
-          <w:szCs w:val="22"/>
-        </w:rPr>
-        <w:t xml:space="preserve">« Mes résultats » garde l'historique de toutes vos tentatives pour suivre votre progression.</w:t>
+        <w:t xml:space="preserve">La reconnaissance par empreinte digitale (facultative)</w:t>
+      </w:r>
+    </w:p>
+    <w:p>
+      <w:pPr>
+        <w:spacing w:after="120"/>
+      </w:pPr>
+      <w:r>
+        <w:rPr>
+          <w:sz w:val="22"/>
+          <w:szCs w:val="22"/>
+        </w:rPr>
+        <w:t xml:space="preserve">Sur la page « Passer un test », une carte « Reconnaissance par empreinte digitale » vous propose d'attester votre identité avant chaque épreuve. Comment ça fonctionne : c'est le capteur DE VOTRE APPAREIL qui vérifie votre doigt — le lecteur d'empreinte de votre téléphone, ou la reconnaissance de votre ordinateur (Windows Hello). Votre empreinte NE QUITTE JAMAIS votre appareil : EduWeb ne la voit pas et ne la stocke pas ; le site reçoit seulement une preuve chiffrée que c'est bien vous.</w:t>
+      </w:r>
+    </w:p>
+    <w:p>
+      <w:pPr>
+        <w:spacing w:after="120"/>
+      </w:pPr>
+      <w:r>
+        <w:rPr>
+          <w:sz w:val="22"/>
+          <w:szCs w:val="22"/>
+        </w:rPr>
+        <w:t xml:space="preserve">Enregistrer votre empreinte (une seule fois par appareil) :</w:t>
+      </w:r>
+    </w:p>
+    <w:p>
+      <w:pPr>
+        <w:pStyle w:val="ListParagraph"/>
+        <w:numPr>
+          <w:ilvl w:val="0"/>
+          <w:numId w:val="13"/>
+        </w:numPr>
+        <w:spacing w:after="40"/>
+      </w:pPr>
+      <w:r>
+        <w:rPr>
+          <w:sz w:val="22"/>
+          <w:szCs w:val="22"/>
+        </w:rPr>
+        <w:t xml:space="preserve">Ouvrez « Passer un test » et appuyez sur « Enregistrer mon empreinte » dans la carte.</w:t>
+      </w:r>
+    </w:p>
+    <w:p>
+      <w:pPr>
+        <w:pStyle w:val="ListParagraph"/>
+        <w:numPr>
+          <w:ilvl w:val="0"/>
+          <w:numId w:val="13"/>
+        </w:numPr>
+        <w:spacing w:after="40"/>
+      </w:pPr>
+      <w:r>
+        <w:rPr>
+          <w:sz w:val="22"/>
+          <w:szCs w:val="22"/>
+        </w:rPr>
+        <w:t xml:space="preserve">Votre appareil prend la main : posez le doigt sur le capteur (ou utilisez le visage ou le code de l'appareil, selon ce qu'il propose).</w:t>
+      </w:r>
+    </w:p>
+    <w:p>
+      <w:pPr>
+        <w:pStyle w:val="ListParagraph"/>
+        <w:numPr>
+          <w:ilvl w:val="0"/>
+          <w:numId w:val="13"/>
+        </w:numPr>
+        <w:spacing w:after="40"/>
+      </w:pPr>
+      <w:r>
+        <w:rPr>
+          <w:sz w:val="22"/>
+          <w:szCs w:val="22"/>
+        </w:rPr>
+        <w:t xml:space="preserve">Le message « Empreinte enregistrée ✅ » confirme : c'est terminé.</w:t>
+      </w:r>
+    </w:p>
+    <w:p>
+      <w:pPr>
+        <w:spacing w:after="120"/>
+      </w:pPr>
+      <w:r>
+        <w:rPr>
+          <w:sz w:val="22"/>
+          <w:szCs w:val="22"/>
+        </w:rPr>
+        <w:t xml:space="preserve">Avant chaque test, une fois l'empreinte enregistrée :</w:t>
+      </w:r>
+    </w:p>
+    <w:p>
+      <w:pPr>
+        <w:pStyle w:val="ListParagraph"/>
+        <w:numPr>
+          <w:ilvl w:val="0"/>
+          <w:numId w:val="14"/>
+        </w:numPr>
+        <w:spacing w:after="40"/>
+      </w:pPr>
+      <w:r>
+        <w:rPr>
+          <w:sz w:val="22"/>
+          <w:szCs w:val="22"/>
+        </w:rPr>
+        <w:t xml:space="preserve">Appuyez sur « Vérifier mon identité », puis posez le doigt sur le capteur quand l'appareil le demande.</w:t>
+      </w:r>
+    </w:p>
+    <w:p>
+      <w:pPr>
+        <w:pStyle w:val="ListParagraph"/>
+        <w:numPr>
+          <w:ilvl w:val="0"/>
+          <w:numId w:val="14"/>
+        </w:numPr>
+        <w:spacing w:after="40"/>
+      </w:pPr>
+      <w:r>
+        <w:rPr>
+          <w:sz w:val="22"/>
+          <w:szCs w:val="22"/>
+        </w:rPr>
+        <w:t xml:space="preserve">Le message « Identité vérifiée ✅ » s'affiche : vous avez une dizaine de minutes pour démarrer votre test.</w:t>
+      </w:r>
+    </w:p>
+    <w:p>
+      <w:pPr>
+        <w:pStyle w:val="ListParagraph"/>
+        <w:numPr>
+          <w:ilvl w:val="0"/>
+          <w:numId w:val="14"/>
+        </w:numPr>
+        <w:spacing w:after="40"/>
+      </w:pPr>
+      <w:r>
+        <w:rPr>
+          <w:sz w:val="22"/>
+          <w:szCs w:val="22"/>
+        </w:rPr>
+        <w:t xml:space="preserve">Sans cette vérification, le bouton « Démarrer le test » vous renverra vers la carte d'empreinte.</w:t>
+      </w:r>
+    </w:p>
+    <w:p>
+      <w:pPr>
+        <w:pStyle w:val="ListParagraph"/>
+        <w:numPr>
+          <w:ilvl w:val="0"/>
+          <w:numId w:val="2"/>
+        </w:numPr>
+        <w:spacing w:after="40"/>
+      </w:pPr>
+      <w:r>
+        <w:rPr>
+          <w:sz w:val="22"/>
+          <w:szCs w:val="22"/>
+        </w:rPr>
+        <w:t xml:space="preserve">C'est FACULTATIF : si vous n'enregistrez pas d'empreinte, les tests fonctionnent normalement.</w:t>
+      </w:r>
+    </w:p>
+    <w:p>
+      <w:pPr>
+        <w:pStyle w:val="ListParagraph"/>
+        <w:numPr>
+          <w:ilvl w:val="0"/>
+          <w:numId w:val="2"/>
+        </w:numPr>
+        <w:spacing w:after="40"/>
+      </w:pPr>
+      <w:r>
+        <w:rPr>
+          <w:sz w:val="22"/>
+          <w:szCs w:val="22"/>
+        </w:rPr>
+        <w:t xml:space="preserve">L'enregistrement vaut pour L'APPAREIL utilisé : si vous changez de téléphone ou d'ordinateur, refaites l'enregistrement sur le nouveau.</w:t>
+      </w:r>
+    </w:p>
+    <w:p>
+      <w:pPr>
+        <w:pStyle w:val="ListParagraph"/>
+        <w:numPr>
+          <w:ilvl w:val="0"/>
+          <w:numId w:val="2"/>
+        </w:numPr>
+        <w:spacing w:after="40"/>
+      </w:pPr>
+      <w:r>
+        <w:rPr>
+          <w:sz w:val="22"/>
+          <w:szCs w:val="22"/>
+        </w:rPr>
+        <w:t xml:space="preserve">Votre appareil doit avoir un capteur ET un verrouillage configuré (empreinte, visage ou code). Sinon, la carte vous indiquera que la biométrie n'est pas disponible — ce n'est pas bloquant.</w:t>
+      </w:r>
+    </w:p>
+    <w:p>
+      <w:pPr>
+        <w:pStyle w:val="ListParagraph"/>
+        <w:numPr>
+          <w:ilvl w:val="0"/>
+          <w:numId w:val="2"/>
+        </w:numPr>
+        <w:spacing w:after="40"/>
+      </w:pPr>
+      <w:r>
+        <w:rPr>
+          <w:sz w:val="22"/>
+          <w:szCs w:val="22"/>
+        </w:rPr>
+        <w:t xml:space="preserve">Le bouton « Supprimer l'empreinte » (dans la même carte) retire l'enregistrement à tout moment ; la vérification ne sera alors plus demandée.</w:t>
       </w:r>
     </w:p>
     <w:p>
@@ -2148,6 +2286,95 @@
           <w:sz w:val="21"/>
           <w:szCs w:val="21"/>
         </w:rPr>
+        <w:t xml:space="preserve">Pourquoi cette option ? Pour les usages « sérieux » (préparation encadrée, familles qui partagent un appareil), elle atteste que c'est bien le candidat inscrit qui compose — et pas quelqu'un d'autre sur sa session.</w:t>
+      </w:r>
+    </w:p>
+    <w:p>
+      <w:pPr>
+        <w:pStyle w:val="Heading2"/>
+      </w:pPr>
+      <w:r>
+        <w:t xml:space="preserve">Comprendre vos résultats</w:t>
+      </w:r>
+    </w:p>
+    <w:p>
+      <w:pPr>
+        <w:pStyle w:val="ListParagraph"/>
+        <w:numPr>
+          <w:ilvl w:val="0"/>
+          <w:numId w:val="2"/>
+        </w:numPr>
+        <w:spacing w:after="40"/>
+      </w:pPr>
+      <w:r>
+        <w:rPr>
+          <w:sz w:val="22"/>
+          <w:szCs w:val="22"/>
+        </w:rPr>
+        <w:t xml:space="preserve">Après chaque test : votre score, vos points forts et vos points à travailler, un plan d'amélioration concret et des conseils d'orientation (quels concours correspondent à votre profil).</w:t>
+      </w:r>
+    </w:p>
+    <w:p>
+      <w:pPr>
+        <w:pStyle w:val="ListParagraph"/>
+        <w:numPr>
+          <w:ilvl w:val="0"/>
+          <w:numId w:val="2"/>
+        </w:numPr>
+        <w:spacing w:after="40"/>
+      </w:pPr>
+      <w:r>
+        <w:rPr>
+          <w:sz w:val="22"/>
+          <w:szCs w:val="22"/>
+        </w:rPr>
+        <w:t xml:space="preserve">La correction complète est disponible question par question, avec l'explication de la bonne réponse — et le bouton « 🔊 Écouter » sur chacune.</w:t>
+      </w:r>
+    </w:p>
+    <w:p>
+      <w:pPr>
+        <w:pStyle w:val="ListParagraph"/>
+        <w:numPr>
+          <w:ilvl w:val="0"/>
+          <w:numId w:val="2"/>
+        </w:numPr>
+        <w:spacing w:after="40"/>
+      </w:pPr>
+      <w:r>
+        <w:rPr>
+          <w:sz w:val="22"/>
+          <w:szCs w:val="22"/>
+        </w:rPr>
+        <w:t xml:space="preserve">« Mes résultats » garde l'historique de toutes vos tentatives pour suivre votre progression.</w:t>
+      </w:r>
+    </w:p>
+    <w:p>
+      <w:pPr>
+        <w:pBdr>
+          <w:top w:val="single" w:color="E8F5EC" w:sz="2" w:space="6"/>
+          <w:bottom w:val="single" w:color="E8F5EC" w:sz="2" w:space="6"/>
+          <w:left w:val="single" w:color="1E9E57" w:sz="18" w:space="10"/>
+          <w:right w:val="single" w:color="E8F5EC" w:sz="2" w:space="6"/>
+        </w:pBdr>
+        <w:shd w:fill="E8F5EC" w:color="auto" w:val="clear"/>
+        <w:spacing w:after="140" w:before="80"/>
+      </w:pPr>
+      <w:r>
+        <w:rPr>
+          <w:b/>
+          <w:bCs/>
+          <w:color w:val="1E9E57"/>
+          <w:sz w:val="21"/>
+          <w:szCs w:val="21"/>
+        </w:rPr>
+        <w:t xml:space="preserve">À noter — </w:t>
+      </w:r>
+      <w:r>
+        <w:rPr>
+          <w:color w:val="1A3A28"/>
+          <w:sz w:val="21"/>
+          <w:szCs w:val="21"/>
+        </w:rPr>
         <w:t xml:space="preserve">Selon votre formule, votre accès peut avoir une durée (par exemple 90 jours) et un nombre de tests. Ils sont affichés dans votre espace Formation ; au bout, vous pouvez renouveler — votre historique est conservé.</w:t>
       </w:r>
     </w:p>
@@ -2260,7 +2487,7 @@
         <w:pStyle w:val="ListParagraph"/>
         <w:numPr>
           <w:ilvl w:val="0"/>
-          <w:numId w:val="13"/>
+          <w:numId w:val="15"/>
         </w:numPr>
         <w:spacing w:after="40"/>
       </w:pPr>
@@ -2277,7 +2504,7 @@
         <w:pStyle w:val="ListParagraph"/>
         <w:numPr>
           <w:ilvl w:val="0"/>
-          <w:numId w:val="13"/>
+          <w:numId w:val="15"/>
         </w:numPr>
         <w:spacing w:after="40"/>
       </w:pPr>
@@ -2294,7 +2521,7 @@
         <w:pStyle w:val="ListParagraph"/>
         <w:numPr>
           <w:ilvl w:val="0"/>
-          <w:numId w:val="13"/>
+          <w:numId w:val="15"/>
         </w:numPr>
         <w:spacing w:after="40"/>
       </w:pPr>
@@ -2311,7 +2538,7 @@
         <w:pStyle w:val="ListParagraph"/>
         <w:numPr>
           <w:ilvl w:val="0"/>
-          <w:numId w:val="13"/>
+          <w:numId w:val="15"/>
         </w:numPr>
         <w:spacing w:after="40"/>
       </w:pPr>
@@ -2752,6 +2979,30 @@
     </w:lvl>
   </w:abstractNum>
   <w:abstractNum w:abstractNumId="13" w15:restartNumberingAfterBreak="0">
+    <w:multiLevelType w:val="hybridMultilevel"/>
+    <w:lvl w:ilvl="0" w15:tentative="1">
+      <w:start w:val="1"/>
+      <w:numFmt w:val="decimal"/>
+      <w:lvlText w:val="%1."/>
+      <w:lvlJc w:val="left"/>
+      <w:pPr>
+        <w:ind w:left="540" w:hanging="300"/>
+      </w:pPr>
+    </w:lvl>
+  </w:abstractNum>
+  <w:abstractNum w:abstractNumId="14" w15:restartNumberingAfterBreak="0">
+    <w:multiLevelType w:val="hybridMultilevel"/>
+    <w:lvl w:ilvl="0" w15:tentative="1">
+      <w:start w:val="1"/>
+      <w:numFmt w:val="decimal"/>
+      <w:lvlText w:val="%1."/>
+      <w:lvlJc w:val="left"/>
+      <w:pPr>
+        <w:ind w:left="540" w:hanging="300"/>
+      </w:pPr>
+    </w:lvl>
+  </w:abstractNum>
+  <w:abstractNum w:abstractNumId="15" w15:restartNumberingAfterBreak="0">
     <w:multiLevelType w:val="hybridMultilevel"/>
     <w:lvl w:ilvl="0" w15:tentative="1">
       <w:start w:val="1"/>
@@ -2837,6 +3088,18 @@
   </w:num>
   <w:num w:numId="13">
     <w:abstractNumId w:val="13"/>
+    <w:lvlOverride w:ilvl="0">
+      <w:startOverride w:val="1"/>
+    </w:lvlOverride>
+  </w:num>
+  <w:num w:numId="14">
+    <w:abstractNumId w:val="14"/>
+    <w:lvlOverride w:ilvl="0">
+      <w:startOverride w:val="1"/>
+    </w:lvlOverride>
+  </w:num>
+  <w:num w:numId="15">
+    <w:abstractNumId w:val="15"/>
     <w:lvlOverride w:ilvl="0">
       <w:startOverride w:val="1"/>
     </w:lvlOverride>

</xml_diff>